<commit_message>
Fix workbook consistency defects and author approved GRC scenario decisions
</commit_message>
<xml_diff>
--- a/02-cascade-civic-rev5-ato/artifacts/security_assessment_report.docx
+++ b/02-cascade-civic-rev5-ato/artifacts/security_assessment_report.docx
@@ -108,7 +108,7 @@
         <w:spacing w:after="160"/>
       </w:pPr>
       <w:r>
-        <w:t xml:space="preserve">Of the controls assessed, 22 were determined Satisfied and 8 were determined Other Than Satisfied. Eight findings were identified: two rated High risk, four Moderate, and two Low. No finding indicated an active compromise, and no control deficiency was assessed as rendering the system fundamentally unsuitable for operation.</w:t>
+        <w:t>Of the controls assessed, 21 were determined Satisfied and 9 were determined Other Than Satisfied. Eight findings were identified: two rated High risk, four Moderate, and two Low. No finding indicated an active compromise, and no control deficiency was assessed as rendering the system fundamentally unsuitable for operation.</w:t>
       </w:r>
     </w:p>
     <w:p>
@@ -780,7 +780,7 @@
                 <w:sz w:val="18"/>
                 <w:szCs w:val="18"/>
               </w:rPr>
-              <w:t xml:space="preserve">22</w:t>
+              <w:t>21</w:t>
             </w:r>
           </w:p>
         </w:tc>
@@ -803,7 +803,7 @@
                 <w:sz w:val="18"/>
                 <w:szCs w:val="18"/>
               </w:rPr>
-              <w:t xml:space="preserve">73.3%</w:t>
+              <w:t>70.0%</w:t>
             </w:r>
           </w:p>
         </w:tc>
@@ -874,7 +874,7 @@
                 <w:sz w:val="18"/>
                 <w:szCs w:val="18"/>
               </w:rPr>
-              <w:t xml:space="preserve">8</w:t>
+              <w:t>9</w:t>
             </w:r>
           </w:p>
         </w:tc>
@@ -897,7 +897,7 @@
                 <w:sz w:val="18"/>
                 <w:szCs w:val="18"/>
               </w:rPr>
-              <w:t xml:space="preserve">26.7%</w:t>
+              <w:t>30.0%</w:t>
             </w:r>
           </w:p>
         </w:tc>

</xml_diff>